<commit_message>
feat: add support for editing exam paper titles via inline UI and backend update endpoint
</commit_message>
<xml_diff>
--- a/backend/src/main/resources/学号_姓名_答题纸A卷.docx
+++ b/backend/src/main/resources/学号_姓名_答题纸A卷.docx
@@ -35,14 +35,14 @@
       </w:r>
       <w:r>
         <w:rPr>
-          <w:rFonts w:hint="default" w:ascii="黑体" w:eastAsia="黑体"/>
+          <w:rFonts w:hint="eastAsia" w:ascii="黑体" w:eastAsia="黑体"/>
           <w:b/>
           <w:sz w:val="36"/>
           <w:szCs w:val="36"/>
           <w:u w:val="single"/>
-          <w:lang w:val="en-US"/>
-        </w:rPr>
-        <w:t>4</w:t>
+          <w:lang w:val="en-US" w:eastAsia="zh-CN"/>
+        </w:rPr>
+        <w:t>5</w:t>
       </w:r>
       <w:r>
         <w:rPr>
@@ -65,14 +65,14 @@
       </w:r>
       <w:r>
         <w:rPr>
-          <w:rFonts w:hint="default" w:ascii="黑体" w:eastAsia="黑体"/>
+          <w:rFonts w:hint="eastAsia" w:ascii="黑体" w:eastAsia="黑体"/>
           <w:b/>
           <w:sz w:val="36"/>
           <w:szCs w:val="36"/>
           <w:u w:val="single"/>
-          <w:lang w:val="en-US"/>
-        </w:rPr>
-        <w:t>5</w:t>
+          <w:lang w:val="en-US" w:eastAsia="zh-CN"/>
+        </w:rPr>
+        <w:t>6</w:t>
       </w:r>
       <w:r>
         <w:rPr>
@@ -140,7 +140,7 @@
           <w:u w:val="single"/>
           <w:lang w:val="en-US"/>
         </w:rPr>
-        <w:t>3</w:t>
+        <w:t>5</w:t>
       </w:r>
       <w:r>
         <w:rPr>
@@ -174,7 +174,16 @@
           <w:sz w:val="36"/>
           <w:szCs w:val="36"/>
         </w:rPr>
-        <w:t>专业（方向）</w:t>
+        <w:t>专业</w:t>
+      </w:r>
+      <w:r>
+        <w:rPr>
+          <w:rFonts w:hint="eastAsia" w:ascii="黑体" w:eastAsia="黑体"/>
+          <w:sz w:val="36"/>
+          <w:szCs w:val="36"/>
+          <w:lang w:val="en-US" w:eastAsia="zh-CN"/>
+        </w:rPr>
+        <w:t xml:space="preserve"> </w:t>
       </w:r>
       <w:r>
         <w:rPr>
@@ -182,17 +191,9 @@
           <w:sz w:val="36"/>
           <w:szCs w:val="36"/>
           <w:u w:val="single"/>
-        </w:rPr>
-        <w:t>J</w:t>
-      </w:r>
-      <w:r>
-        <w:rPr>
-          <w:rFonts w:ascii="黑体" w:hAnsi="Calibri" w:eastAsia="黑体" w:cs="Times New Roman"/>
-          <w:sz w:val="36"/>
-          <w:szCs w:val="36"/>
-          <w:u w:val="single"/>
-        </w:rPr>
-        <w:t>AVA</w:t>
+          <w:lang w:val="en-US" w:eastAsia="zh-CN"/>
+        </w:rPr>
+        <w:t>面向对象</w:t>
       </w:r>
       <w:r>
         <w:rPr>
@@ -448,11 +449,21 @@
               </w:tabs>
               <w:jc w:val="center"/>
               <w:rPr>
+                <w:rFonts w:hint="default" w:ascii="黑体" w:eastAsia="黑体"/>
+                <w:sz w:val="28"/>
+                <w:szCs w:val="28"/>
+                <w:lang w:val="en-US" w:eastAsia="zh-CN"/>
+              </w:rPr>
+            </w:pPr>
+            <w:r>
+              <w:rPr>
                 <w:rFonts w:hint="eastAsia" w:ascii="黑体" w:eastAsia="黑体"/>
                 <w:sz w:val="28"/>
                 <w:szCs w:val="28"/>
-              </w:rPr>
-            </w:pPr>
+                <w:lang w:val="en-US" w:eastAsia="zh-CN"/>
+              </w:rPr>
+              <w:t>四</w:t>
+            </w:r>
           </w:p>
         </w:tc>
         <w:tc>
@@ -1062,9 +1073,10 @@
     <w:p>
       <w:pPr>
         <w:rPr>
-          <w:rFonts w:ascii="黑体" w:eastAsia="黑体"/>
-          <w:sz w:val="24"/>
-          <w:u w:val="single"/>
+          <w:rFonts w:hint="eastAsia" w:ascii="黑体" w:eastAsia="黑体"/>
+          <w:sz w:val="24"/>
+          <w:u w:val="single"/>
+          <w:lang w:val="en-US" w:eastAsia="zh-CN"/>
         </w:rPr>
       </w:pPr>
       <w:r>
@@ -1086,6 +1098,15 @@
         <w:rPr>
           <w:rFonts w:hint="eastAsia" w:ascii="黑体" w:eastAsia="黑体"/>
           <w:sz w:val="24"/>
+          <w:u w:val="single"/>
+          <w:lang w:val="en-US" w:eastAsia="zh-CN"/>
+        </w:rPr>
+        <w:t xml:space="preserve"> </w:t>
+      </w:r>
+      <w:r>
+        <w:rPr>
+          <w:rFonts w:hint="eastAsia" w:ascii="黑体" w:eastAsia="黑体"/>
+          <w:sz w:val="24"/>
         </w:rPr>
         <w:t>2、</w:t>
       </w:r>
@@ -1101,6 +1122,15 @@
         <w:rPr>
           <w:rFonts w:hint="eastAsia" w:ascii="黑体" w:eastAsia="黑体"/>
           <w:sz w:val="24"/>
+          <w:u w:val="single"/>
+          <w:lang w:val="en-US" w:eastAsia="zh-CN"/>
+        </w:rPr>
+        <w:t xml:space="preserve"> </w:t>
+      </w:r>
+      <w:r>
+        <w:rPr>
+          <w:rFonts w:hint="eastAsia" w:ascii="黑体" w:eastAsia="黑体"/>
+          <w:sz w:val="24"/>
         </w:rPr>
         <w:t>3、</w:t>
       </w:r>
@@ -1116,6 +1146,15 @@
         <w:rPr>
           <w:rFonts w:hint="eastAsia" w:ascii="黑体" w:eastAsia="黑体"/>
           <w:sz w:val="24"/>
+          <w:u w:val="single"/>
+          <w:lang w:val="en-US" w:eastAsia="zh-CN"/>
+        </w:rPr>
+        <w:t xml:space="preserve"> </w:t>
+      </w:r>
+      <w:r>
+        <w:rPr>
+          <w:rFonts w:hint="eastAsia" w:ascii="黑体" w:eastAsia="黑体"/>
+          <w:sz w:val="24"/>
         </w:rPr>
         <w:t>4、</w:t>
       </w:r>
@@ -1131,6 +1170,15 @@
         <w:rPr>
           <w:rFonts w:hint="eastAsia" w:ascii="黑体" w:eastAsia="黑体"/>
           <w:sz w:val="24"/>
+          <w:u w:val="single"/>
+          <w:lang w:val="en-US" w:eastAsia="zh-CN"/>
+        </w:rPr>
+        <w:t xml:space="preserve"> </w:t>
+      </w:r>
+      <w:r>
+        <w:rPr>
+          <w:rFonts w:hint="eastAsia" w:ascii="黑体" w:eastAsia="黑体"/>
+          <w:sz w:val="24"/>
         </w:rPr>
         <w:t>5、</w:t>
       </w:r>
@@ -1142,6 +1190,17 @@
         </w:rPr>
         <w:t>　　　</w:t>
       </w:r>
+      <w:r>
+        <w:rPr>
+          <w:rFonts w:hint="eastAsia" w:ascii="黑体" w:eastAsia="黑体"/>
+          <w:sz w:val="24"/>
+          <w:u w:val="single"/>
+          <w:lang w:val="en-US" w:eastAsia="zh-CN"/>
+        </w:rPr>
+        <w:t xml:space="preserve"> </w:t>
+      </w:r>
+      <w:bookmarkStart w:id="0" w:name="_GoBack"/>
+      <w:bookmarkEnd w:id="0"/>
     </w:p>
     <w:p>
       <w:pPr>
@@ -1155,7 +1214,7 @@
     <w:p>
       <w:pPr>
         <w:rPr>
-          <w:rFonts w:ascii="黑体" w:eastAsia="黑体"/>
+          <w:rFonts w:hint="eastAsia" w:ascii="黑体" w:eastAsia="黑体"/>
           <w:sz w:val="24"/>
           <w:u w:val="single"/>
         </w:rPr>
@@ -1185,6 +1244,15 @@
       </w:r>
       <w:r>
         <w:rPr>
+          <w:rFonts w:hint="eastAsia" w:ascii="黑体" w:eastAsia="黑体"/>
+          <w:sz w:val="24"/>
+          <w:u w:val="single"/>
+          <w:lang w:val="en-US" w:eastAsia="zh-CN"/>
+        </w:rPr>
+        <w:t xml:space="preserve"> </w:t>
+      </w:r>
+      <w:r>
+        <w:rPr>
           <w:rFonts w:hint="default" w:ascii="黑体" w:eastAsia="黑体"/>
           <w:sz w:val="24"/>
           <w:lang w:val="en-US"/>
@@ -1208,6 +1276,15 @@
       </w:r>
       <w:r>
         <w:rPr>
+          <w:rFonts w:hint="eastAsia" w:ascii="黑体" w:eastAsia="黑体"/>
+          <w:sz w:val="24"/>
+          <w:u w:val="single"/>
+          <w:lang w:val="en-US" w:eastAsia="zh-CN"/>
+        </w:rPr>
+        <w:t xml:space="preserve"> </w:t>
+      </w:r>
+      <w:r>
+        <w:rPr>
           <w:rFonts w:hint="default" w:ascii="黑体" w:eastAsia="黑体"/>
           <w:sz w:val="24"/>
           <w:lang w:val="en-US"/>
@@ -1231,6 +1308,15 @@
       </w:r>
       <w:r>
         <w:rPr>
+          <w:rFonts w:hint="eastAsia" w:ascii="黑体" w:eastAsia="黑体"/>
+          <w:sz w:val="24"/>
+          <w:u w:val="single"/>
+          <w:lang w:val="en-US" w:eastAsia="zh-CN"/>
+        </w:rPr>
+        <w:t xml:space="preserve"> </w:t>
+      </w:r>
+      <w:r>
+        <w:rPr>
           <w:rFonts w:hint="default" w:ascii="黑体" w:eastAsia="黑体"/>
           <w:sz w:val="24"/>
           <w:lang w:val="en-US"/>
@@ -1254,11 +1340,154 @@
       </w:r>
       <w:r>
         <w:rPr>
+          <w:rFonts w:hint="eastAsia" w:ascii="黑体" w:eastAsia="黑体"/>
+          <w:sz w:val="24"/>
+          <w:u w:val="single"/>
+          <w:lang w:val="en-US" w:eastAsia="zh-CN"/>
+        </w:rPr>
+        <w:t xml:space="preserve"> </w:t>
+      </w:r>
+      <w:r>
+        <w:rPr>
           <w:rFonts w:hint="default" w:ascii="黑体" w:eastAsia="黑体"/>
           <w:sz w:val="24"/>
           <w:lang w:val="en-US"/>
         </w:rPr>
         <w:t>10</w:t>
+      </w:r>
+      <w:r>
+        <w:rPr>
+          <w:rFonts w:hint="eastAsia" w:ascii="黑体" w:eastAsia="黑体"/>
+          <w:sz w:val="24"/>
+        </w:rPr>
+        <w:t>、</w:t>
+      </w:r>
+      <w:r>
+        <w:rPr>
+          <w:rFonts w:hint="eastAsia" w:ascii="黑体" w:eastAsia="黑体"/>
+          <w:sz w:val="24"/>
+          <w:u w:val="single"/>
+        </w:rPr>
+        <w:t>　　　</w:t>
+      </w:r>
+    </w:p>
+    <w:p>
+      <w:pPr>
+        <w:rPr>
+          <w:rFonts w:hint="eastAsia" w:ascii="黑体" w:eastAsia="黑体"/>
+          <w:sz w:val="24"/>
+          <w:u w:val="single"/>
+          <w:lang w:val="en-US" w:eastAsia="zh-CN"/>
+        </w:rPr>
+      </w:pPr>
+    </w:p>
+    <w:p>
+      <w:pPr>
+        <w:rPr>
+          <w:rFonts w:hint="eastAsia" w:ascii="黑体" w:eastAsia="黑体"/>
+          <w:sz w:val="24"/>
+          <w:u w:val="single"/>
+        </w:rPr>
+      </w:pPr>
+      <w:r>
+        <w:rPr>
+          <w:rFonts w:hint="eastAsia" w:ascii="黑体" w:eastAsia="黑体"/>
+          <w:sz w:val="24"/>
+          <w:lang w:val="en-US" w:eastAsia="zh-CN"/>
+        </w:rPr>
+        <w:t>11</w:t>
+      </w:r>
+      <w:r>
+        <w:rPr>
+          <w:rFonts w:hint="eastAsia" w:ascii="黑体" w:eastAsia="黑体"/>
+          <w:sz w:val="24"/>
+        </w:rPr>
+        <w:t>、</w:t>
+      </w:r>
+      <w:r>
+        <w:rPr>
+          <w:rFonts w:hint="eastAsia" w:ascii="黑体" w:eastAsia="黑体"/>
+          <w:sz w:val="24"/>
+          <w:u w:val="single"/>
+        </w:rPr>
+        <w:t>　　</w:t>
+      </w:r>
+      <w:r>
+        <w:rPr>
+          <w:rFonts w:hint="eastAsia" w:ascii="黑体" w:eastAsia="黑体"/>
+          <w:sz w:val="24"/>
+          <w:lang w:val="en-US" w:eastAsia="zh-CN"/>
+        </w:rPr>
+        <w:t>12</w:t>
+      </w:r>
+      <w:r>
+        <w:rPr>
+          <w:rFonts w:hint="eastAsia" w:ascii="黑体" w:eastAsia="黑体"/>
+          <w:sz w:val="24"/>
+        </w:rPr>
+        <w:t>、</w:t>
+      </w:r>
+      <w:r>
+        <w:rPr>
+          <w:rFonts w:hint="eastAsia" w:ascii="黑体" w:eastAsia="黑体"/>
+          <w:sz w:val="24"/>
+          <w:u w:val="single"/>
+        </w:rPr>
+        <w:t>　　　</w:t>
+      </w:r>
+      <w:r>
+        <w:rPr>
+          <w:rFonts w:hint="eastAsia" w:ascii="黑体" w:eastAsia="黑体"/>
+          <w:sz w:val="24"/>
+          <w:lang w:val="en-US" w:eastAsia="zh-CN"/>
+        </w:rPr>
+        <w:t>13</w:t>
+      </w:r>
+      <w:r>
+        <w:rPr>
+          <w:rFonts w:hint="eastAsia" w:ascii="黑体" w:eastAsia="黑体"/>
+          <w:sz w:val="24"/>
+        </w:rPr>
+        <w:t>、</w:t>
+      </w:r>
+      <w:r>
+        <w:rPr>
+          <w:rFonts w:hint="eastAsia" w:ascii="黑体" w:eastAsia="黑体"/>
+          <w:sz w:val="24"/>
+          <w:u w:val="single"/>
+        </w:rPr>
+        <w:t>　　　</w:t>
+      </w:r>
+      <w:r>
+        <w:rPr>
+          <w:rFonts w:hint="eastAsia" w:ascii="黑体" w:eastAsia="黑体"/>
+          <w:sz w:val="24"/>
+          <w:lang w:val="en-US" w:eastAsia="zh-CN"/>
+        </w:rPr>
+        <w:t>14</w:t>
+      </w:r>
+      <w:r>
+        <w:rPr>
+          <w:rFonts w:hint="eastAsia" w:ascii="黑体" w:eastAsia="黑体"/>
+          <w:sz w:val="24"/>
+        </w:rPr>
+        <w:t>、</w:t>
+      </w:r>
+      <w:r>
+        <w:rPr>
+          <w:rFonts w:hint="eastAsia" w:ascii="黑体" w:eastAsia="黑体"/>
+          <w:sz w:val="24"/>
+          <w:u w:val="single"/>
+        </w:rPr>
+        <w:t>　　　</w:t>
+      </w:r>
+      <w:r>
+        <w:rPr>
+          <w:rFonts w:hint="eastAsia" w:ascii="黑体" w:eastAsia="黑体"/>
+          <w:sz w:val="24"/>
+          <w:lang w:val="en-US" w:eastAsia="zh-CN"/>
+        </w:rPr>
+        <w:t>15</w:t>
       </w:r>
       <w:r>
         <w:rPr>
@@ -1783,71 +2012,22 @@
         <w:ind w:firstLineChars="0"/>
         <w:outlineLvl w:val="0"/>
         <w:rPr>
-          <w:rFonts w:hint="eastAsia" w:asciiTheme="minorEastAsia" w:hAnsiTheme="minorEastAsia"/>
-          <w:szCs w:val="21"/>
-        </w:rPr>
-      </w:pPr>
-      <w:r>
-        <w:rPr>
-          <w:rFonts w:hint="eastAsia" w:ascii="黑体" w:hAnsi="宋体" w:eastAsia="黑体"/>
-          <w:b/>
-          <w:bCs/>
-          <w:sz w:val="24"/>
-        </w:rPr>
-        <w:t>编程题（共</w:t>
-      </w:r>
-      <w:r>
-        <w:rPr>
-          <w:rFonts w:ascii="黑体" w:hAnsi="宋体" w:eastAsia="黑体"/>
-          <w:b/>
-          <w:bCs/>
-          <w:sz w:val="24"/>
-        </w:rPr>
-        <w:t>6</w:t>
-      </w:r>
-      <w:r>
-        <w:rPr>
-          <w:rFonts w:hint="eastAsia" w:ascii="黑体" w:hAnsi="宋体" w:eastAsia="黑体"/>
-          <w:b/>
-          <w:bCs/>
-          <w:sz w:val="24"/>
-        </w:rPr>
-        <w:t>小题，</w:t>
-      </w:r>
-      <w:r>
-        <w:rPr>
-          <w:rFonts w:hint="default" w:ascii="黑体" w:hAnsi="宋体" w:eastAsia="黑体"/>
-          <w:b/>
-          <w:bCs/>
-          <w:sz w:val="24"/>
-          <w:lang w:val="en-US"/>
-        </w:rPr>
-        <w:t>7</w:t>
-      </w:r>
-      <w:r>
-        <w:rPr>
-          <w:rFonts w:ascii="黑体" w:hAnsi="宋体" w:eastAsia="黑体"/>
-          <w:b/>
-          <w:bCs/>
-          <w:sz w:val="24"/>
-        </w:rPr>
-        <w:t>0</w:t>
-      </w:r>
-      <w:r>
-        <w:rPr>
-          <w:rFonts w:hint="eastAsia" w:ascii="黑体" w:hAnsi="宋体" w:eastAsia="黑体"/>
-          <w:b/>
-          <w:bCs/>
-          <w:sz w:val="24"/>
-        </w:rPr>
-        <w:t>分）</w:t>
-      </w:r>
-      <w:r>
-        <w:rPr>
-          <w:rFonts w:hint="eastAsia" w:ascii="黑体" w:eastAsia="黑体"/>
-          <w:sz w:val="24"/>
-        </w:rPr>
-        <w:t>。</w:t>
+          <w:rFonts w:hint="eastAsia" w:ascii="黑体" w:eastAsia="黑体" w:hAnsiTheme="minorHAnsi" w:cstheme="minorBidi"/>
+          <w:kern w:val="2"/>
+          <w:sz w:val="24"/>
+          <w:szCs w:val="22"/>
+          <w:lang w:val="en-US" w:eastAsia="zh-CN" w:bidi="ar-SA"/>
+        </w:rPr>
+      </w:pPr>
+      <w:r>
+        <w:rPr>
+          <w:rFonts w:hint="eastAsia" w:ascii="黑体" w:eastAsia="黑体" w:hAnsiTheme="minorHAnsi" w:cstheme="minorBidi"/>
+          <w:kern w:val="2"/>
+          <w:sz w:val="24"/>
+          <w:szCs w:val="22"/>
+          <w:lang w:val="en-US" w:eastAsia="zh-CN" w:bidi="ar-SA"/>
+        </w:rPr>
+        <w:t>程序分析题 （需要写出分析过程） (共2题，共10分)</w:t>
       </w:r>
     </w:p>
     <w:p>
@@ -1862,6 +2042,411 @@
         <w:spacing w:line="360" w:lineRule="auto"/>
         <w:outlineLvl w:val="1"/>
         <w:rPr>
+          <w:rFonts w:hint="eastAsia" w:ascii="黑体" w:eastAsia="黑体" w:hAnsiTheme="minorHAnsi" w:cstheme="minorBidi"/>
+          <w:kern w:val="2"/>
+          <w:sz w:val="24"/>
+          <w:szCs w:val="22"/>
+          <w:lang w:val="en-US" w:eastAsia="zh-CN" w:bidi="ar-SA"/>
+        </w:rPr>
+      </w:pPr>
+    </w:p>
+    <w:p>
+      <w:pPr>
+        <w:numPr>
+          <w:ilvl w:val="0"/>
+          <w:numId w:val="0"/>
+        </w:numPr>
+        <w:tabs>
+          <w:tab w:val="left" w:pos="2290"/>
+        </w:tabs>
+        <w:spacing w:line="360" w:lineRule="auto"/>
+        <w:ind w:leftChars="0"/>
+        <w:outlineLvl w:val="1"/>
+        <w:rPr>
+          <w:rFonts w:hint="eastAsia" w:ascii="黑体" w:eastAsia="黑体" w:cstheme="minorBidi"/>
+          <w:kern w:val="2"/>
+          <w:sz w:val="24"/>
+          <w:szCs w:val="22"/>
+          <w:lang w:val="en-US" w:eastAsia="zh-CN" w:bidi="ar-SA"/>
+        </w:rPr>
+      </w:pPr>
+    </w:p>
+    <w:p>
+      <w:pPr>
+        <w:numPr>
+          <w:ilvl w:val="0"/>
+          <w:numId w:val="0"/>
+        </w:numPr>
+        <w:tabs>
+          <w:tab w:val="left" w:pos="2290"/>
+        </w:tabs>
+        <w:spacing w:line="360" w:lineRule="auto"/>
+        <w:ind w:leftChars="0"/>
+        <w:outlineLvl w:val="1"/>
+        <w:rPr>
+          <w:rFonts w:hint="eastAsia" w:ascii="黑体" w:eastAsia="黑体" w:cstheme="minorBidi"/>
+          <w:kern w:val="2"/>
+          <w:sz w:val="24"/>
+          <w:szCs w:val="22"/>
+          <w:lang w:val="en-US" w:eastAsia="zh-CN" w:bidi="ar-SA"/>
+        </w:rPr>
+      </w:pPr>
+    </w:p>
+    <w:p>
+      <w:pPr>
+        <w:numPr>
+          <w:ilvl w:val="0"/>
+          <w:numId w:val="3"/>
+        </w:numPr>
+        <w:tabs>
+          <w:tab w:val="left" w:pos="2290"/>
+        </w:tabs>
+        <w:spacing w:line="360" w:lineRule="auto"/>
+        <w:outlineLvl w:val="1"/>
+        <w:rPr>
+          <w:rFonts w:hint="eastAsia" w:ascii="黑体" w:eastAsia="黑体" w:hAnsiTheme="minorHAnsi" w:cstheme="minorBidi"/>
+          <w:kern w:val="2"/>
+          <w:sz w:val="24"/>
+          <w:szCs w:val="22"/>
+          <w:lang w:val="en-US" w:eastAsia="zh-CN" w:bidi="ar-SA"/>
+        </w:rPr>
+      </w:pPr>
+      <w:r>
+        <w:rPr>
+          <w:rFonts w:hint="eastAsia" w:ascii="黑体" w:eastAsia="黑体" w:hAnsiTheme="minorHAnsi" w:cstheme="minorBidi"/>
+          <w:kern w:val="2"/>
+          <w:sz w:val="24"/>
+          <w:szCs w:val="22"/>
+          <w:lang w:val="en-US" w:eastAsia="zh-CN" w:bidi="ar-SA"/>
+        </w:rPr>
+        <w:t xml:space="preserve">     </w:t>
+      </w:r>
+    </w:p>
+    <w:p>
+      <w:pPr>
+        <w:numPr>
+          <w:ilvl w:val="0"/>
+          <w:numId w:val="0"/>
+        </w:numPr>
+        <w:tabs>
+          <w:tab w:val="left" w:pos="2290"/>
+        </w:tabs>
+        <w:spacing w:line="360" w:lineRule="auto"/>
+        <w:ind w:leftChars="0"/>
+        <w:outlineLvl w:val="1"/>
+        <w:rPr>
+          <w:rFonts w:hint="eastAsia" w:ascii="黑体" w:eastAsia="黑体" w:hAnsiTheme="minorHAnsi" w:cstheme="minorBidi"/>
+          <w:kern w:val="2"/>
+          <w:sz w:val="24"/>
+          <w:szCs w:val="22"/>
+          <w:lang w:val="en-US" w:eastAsia="zh-CN" w:bidi="ar-SA"/>
+        </w:rPr>
+      </w:pPr>
+    </w:p>
+    <w:p>
+      <w:pPr>
+        <w:numPr>
+          <w:ilvl w:val="0"/>
+          <w:numId w:val="0"/>
+        </w:numPr>
+        <w:tabs>
+          <w:tab w:val="left" w:pos="2290"/>
+        </w:tabs>
+        <w:spacing w:line="360" w:lineRule="auto"/>
+        <w:ind w:leftChars="0"/>
+        <w:outlineLvl w:val="1"/>
+        <w:rPr>
+          <w:rFonts w:hint="eastAsia" w:ascii="黑体" w:eastAsia="黑体" w:hAnsiTheme="minorHAnsi" w:cstheme="minorBidi"/>
+          <w:kern w:val="2"/>
+          <w:sz w:val="24"/>
+          <w:szCs w:val="22"/>
+          <w:lang w:val="en-US" w:eastAsia="zh-CN" w:bidi="ar-SA"/>
+        </w:rPr>
+      </w:pPr>
+    </w:p>
+    <w:p>
+      <w:pPr>
+        <w:numPr>
+          <w:ilvl w:val="0"/>
+          <w:numId w:val="0"/>
+        </w:numPr>
+        <w:tabs>
+          <w:tab w:val="left" w:pos="2290"/>
+        </w:tabs>
+        <w:spacing w:line="360" w:lineRule="auto"/>
+        <w:ind w:leftChars="0"/>
+        <w:outlineLvl w:val="1"/>
+        <w:rPr>
+          <w:rFonts w:hint="eastAsia" w:ascii="黑体" w:eastAsia="黑体" w:hAnsiTheme="minorHAnsi" w:cstheme="minorBidi"/>
+          <w:kern w:val="2"/>
+          <w:sz w:val="24"/>
+          <w:szCs w:val="22"/>
+          <w:lang w:val="en-US" w:eastAsia="zh-CN" w:bidi="ar-SA"/>
+        </w:rPr>
+      </w:pPr>
+      <w:r>
+        <w:rPr>
+          <w:rFonts w:hint="eastAsia" w:ascii="黑体" w:eastAsia="黑体" w:hAnsiTheme="minorHAnsi" w:cstheme="minorBidi"/>
+          <w:kern w:val="2"/>
+          <w:sz w:val="24"/>
+          <w:szCs w:val="22"/>
+          <w:lang w:val="en-US" w:eastAsia="zh-CN" w:bidi="ar-SA"/>
+        </w:rPr>
+        <w:t xml:space="preserve">    </w:t>
+      </w:r>
+    </w:p>
+    <w:tbl>
+      <w:tblPr>
+        <w:tblStyle w:val="8"/>
+        <w:tblpPr w:leftFromText="180" w:rightFromText="180" w:vertAnchor="text" w:horzAnchor="margin" w:tblpXSpec="right" w:tblpY="20"/>
+        <w:tblW w:w="0" w:type="auto"/>
+        <w:tblInd w:w="0" w:type="dxa"/>
+        <w:tblBorders>
+          <w:top w:val="single" w:color="auto" w:sz="4" w:space="0"/>
+          <w:left w:val="single" w:color="auto" w:sz="4" w:space="0"/>
+          <w:bottom w:val="single" w:color="auto" w:sz="4" w:space="0"/>
+          <w:right w:val="single" w:color="auto" w:sz="4" w:space="0"/>
+          <w:insideH w:val="single" w:color="auto" w:sz="4" w:space="0"/>
+          <w:insideV w:val="single" w:color="auto" w:sz="4" w:space="0"/>
+        </w:tblBorders>
+        <w:tblLayout w:type="fixed"/>
+        <w:tblCellMar>
+          <w:top w:w="0" w:type="dxa"/>
+          <w:left w:w="108" w:type="dxa"/>
+          <w:bottom w:w="0" w:type="dxa"/>
+          <w:right w:w="108" w:type="dxa"/>
+        </w:tblCellMar>
+      </w:tblPr>
+      <w:tblGrid>
+        <w:gridCol w:w="747"/>
+        <w:gridCol w:w="981"/>
+      </w:tblGrid>
+      <w:tr>
+        <w:tblPrEx>
+          <w:tblBorders>
+            <w:top w:val="single" w:color="auto" w:sz="4" w:space="0"/>
+            <w:left w:val="single" w:color="auto" w:sz="4" w:space="0"/>
+            <w:bottom w:val="single" w:color="auto" w:sz="4" w:space="0"/>
+            <w:right w:val="single" w:color="auto" w:sz="4" w:space="0"/>
+            <w:insideH w:val="single" w:color="auto" w:sz="4" w:space="0"/>
+            <w:insideV w:val="single" w:color="auto" w:sz="4" w:space="0"/>
+          </w:tblBorders>
+        </w:tblPrEx>
+        <w:trPr>
+          <w:trHeight w:val="242" w:hRule="atLeast"/>
+        </w:trPr>
+        <w:tc>
+          <w:tcPr>
+            <w:tcW w:w="747" w:type="dxa"/>
+          </w:tcPr>
+          <w:p>
+            <w:pPr>
+              <w:numPr>
+                <w:ilvl w:val="0"/>
+                <w:numId w:val="0"/>
+              </w:numPr>
+              <w:tabs>
+                <w:tab w:val="left" w:pos="2290"/>
+              </w:tabs>
+              <w:spacing w:line="360" w:lineRule="auto"/>
+              <w:ind w:leftChars="0"/>
+              <w:outlineLvl w:val="1"/>
+              <w:rPr>
+                <w:rFonts w:hint="eastAsia" w:ascii="黑体" w:eastAsia="黑体" w:hAnsiTheme="minorHAnsi" w:cstheme="minorBidi"/>
+                <w:kern w:val="2"/>
+                <w:sz w:val="24"/>
+                <w:szCs w:val="22"/>
+                <w:lang w:val="en-US" w:eastAsia="zh-CN" w:bidi="ar-SA"/>
+              </w:rPr>
+            </w:pPr>
+            <w:r>
+              <w:rPr>
+                <w:rFonts w:hint="eastAsia" w:ascii="黑体" w:eastAsia="黑体" w:hAnsiTheme="minorHAnsi" w:cstheme="minorBidi"/>
+                <w:kern w:val="2"/>
+                <w:sz w:val="24"/>
+                <w:szCs w:val="22"/>
+                <w:lang w:val="en-US" w:eastAsia="zh-CN" w:bidi="ar-SA"/>
+              </w:rPr>
+              <w:t>得分</w:t>
+            </w:r>
+          </w:p>
+        </w:tc>
+        <w:tc>
+          <w:tcPr>
+            <w:tcW w:w="981" w:type="dxa"/>
+          </w:tcPr>
+          <w:p>
+            <w:pPr>
+              <w:numPr>
+                <w:ilvl w:val="0"/>
+                <w:numId w:val="0"/>
+              </w:numPr>
+              <w:tabs>
+                <w:tab w:val="left" w:pos="2290"/>
+              </w:tabs>
+              <w:spacing w:line="360" w:lineRule="auto"/>
+              <w:ind w:leftChars="0"/>
+              <w:outlineLvl w:val="1"/>
+              <w:rPr>
+                <w:rFonts w:hint="eastAsia" w:ascii="黑体" w:eastAsia="黑体" w:hAnsiTheme="minorHAnsi" w:cstheme="minorBidi"/>
+                <w:kern w:val="2"/>
+                <w:sz w:val="24"/>
+                <w:szCs w:val="22"/>
+                <w:lang w:val="en-US" w:eastAsia="zh-CN" w:bidi="ar-SA"/>
+              </w:rPr>
+            </w:pPr>
+            <w:r>
+              <w:rPr>
+                <w:rFonts w:hint="eastAsia" w:ascii="黑体" w:eastAsia="黑体" w:hAnsiTheme="minorHAnsi" w:cstheme="minorBidi"/>
+                <w:kern w:val="2"/>
+                <w:sz w:val="24"/>
+                <w:szCs w:val="22"/>
+                <w:lang w:val="en-US" w:eastAsia="zh-CN" w:bidi="ar-SA"/>
+              </w:rPr>
+              <w:t>评卷人</w:t>
+            </w:r>
+          </w:p>
+        </w:tc>
+      </w:tr>
+      <w:tr>
+        <w:tblPrEx>
+          <w:tblBorders>
+            <w:top w:val="single" w:color="auto" w:sz="4" w:space="0"/>
+            <w:left w:val="single" w:color="auto" w:sz="4" w:space="0"/>
+            <w:bottom w:val="single" w:color="auto" w:sz="4" w:space="0"/>
+            <w:right w:val="single" w:color="auto" w:sz="4" w:space="0"/>
+            <w:insideH w:val="single" w:color="auto" w:sz="4" w:space="0"/>
+            <w:insideV w:val="single" w:color="auto" w:sz="4" w:space="0"/>
+          </w:tblBorders>
+          <w:tblCellMar>
+            <w:top w:w="0" w:type="dxa"/>
+            <w:left w:w="108" w:type="dxa"/>
+            <w:bottom w:w="0" w:type="dxa"/>
+            <w:right w:w="108" w:type="dxa"/>
+          </w:tblCellMar>
+        </w:tblPrEx>
+        <w:trPr>
+          <w:trHeight w:val="254" w:hRule="atLeast"/>
+        </w:trPr>
+        <w:tc>
+          <w:tcPr>
+            <w:tcW w:w="747" w:type="dxa"/>
+          </w:tcPr>
+          <w:p>
+            <w:pPr>
+              <w:numPr>
+                <w:ilvl w:val="0"/>
+                <w:numId w:val="0"/>
+              </w:numPr>
+              <w:tabs>
+                <w:tab w:val="left" w:pos="2290"/>
+              </w:tabs>
+              <w:spacing w:line="360" w:lineRule="auto"/>
+              <w:ind w:leftChars="0"/>
+              <w:outlineLvl w:val="1"/>
+              <w:rPr>
+                <w:rFonts w:hint="eastAsia" w:ascii="黑体" w:eastAsia="黑体" w:hAnsiTheme="minorHAnsi" w:cstheme="minorBidi"/>
+                <w:kern w:val="2"/>
+                <w:sz w:val="24"/>
+                <w:szCs w:val="22"/>
+                <w:lang w:val="en-US" w:eastAsia="zh-CN" w:bidi="ar-SA"/>
+              </w:rPr>
+            </w:pPr>
+          </w:p>
+        </w:tc>
+        <w:tc>
+          <w:tcPr>
+            <w:tcW w:w="981" w:type="dxa"/>
+          </w:tcPr>
+          <w:p>
+            <w:pPr>
+              <w:numPr>
+                <w:ilvl w:val="0"/>
+                <w:numId w:val="0"/>
+              </w:numPr>
+              <w:tabs>
+                <w:tab w:val="left" w:pos="2290"/>
+              </w:tabs>
+              <w:spacing w:line="360" w:lineRule="auto"/>
+              <w:ind w:leftChars="0"/>
+              <w:outlineLvl w:val="1"/>
+              <w:rPr>
+                <w:rFonts w:hint="eastAsia" w:ascii="黑体" w:eastAsia="黑体" w:hAnsiTheme="minorHAnsi" w:cstheme="minorBidi"/>
+                <w:kern w:val="2"/>
+                <w:sz w:val="24"/>
+                <w:szCs w:val="22"/>
+                <w:lang w:val="en-US" w:eastAsia="zh-CN" w:bidi="ar-SA"/>
+              </w:rPr>
+            </w:pPr>
+          </w:p>
+        </w:tc>
+      </w:tr>
+    </w:tbl>
+    <w:p>
+      <w:pPr>
+        <w:numPr>
+          <w:ilvl w:val="0"/>
+          <w:numId w:val="1"/>
+        </w:numPr>
+        <w:tabs>
+          <w:tab w:val="left" w:pos="2290"/>
+        </w:tabs>
+        <w:outlineLvl w:val="0"/>
+        <w:rPr>
+          <w:rFonts w:hint="eastAsia" w:ascii="黑体" w:eastAsia="黑体"/>
+          <w:sz w:val="24"/>
+        </w:rPr>
+      </w:pPr>
+      <w:r>
+        <w:rPr>
+          <w:rFonts w:hint="eastAsia" w:ascii="黑体" w:eastAsia="黑体"/>
+          <w:sz w:val="24"/>
+        </w:rPr>
+        <w:t>编程题（共</w:t>
+      </w:r>
+      <w:r>
+        <w:rPr>
+          <w:rFonts w:hint="default" w:ascii="黑体" w:eastAsia="黑体"/>
+          <w:sz w:val="24"/>
+          <w:lang w:val="en-US"/>
+        </w:rPr>
+        <w:t>3</w:t>
+      </w:r>
+      <w:r>
+        <w:rPr>
+          <w:rFonts w:hint="eastAsia" w:ascii="黑体" w:eastAsia="黑体"/>
+          <w:sz w:val="24"/>
+        </w:rPr>
+        <w:t>小题，</w:t>
+      </w:r>
+      <w:r>
+        <w:rPr>
+          <w:rFonts w:hint="default" w:ascii="黑体" w:eastAsia="黑体"/>
+          <w:sz w:val="24"/>
+          <w:lang w:val="en-US"/>
+        </w:rPr>
+        <w:t>50</w:t>
+      </w:r>
+      <w:r>
+        <w:rPr>
+          <w:rFonts w:hint="eastAsia" w:ascii="黑体" w:eastAsia="黑体"/>
+          <w:sz w:val="24"/>
+        </w:rPr>
+        <w:t>分）。</w:t>
+      </w:r>
+    </w:p>
+    <w:p>
+      <w:pPr>
+        <w:numPr>
+          <w:ilvl w:val="0"/>
+          <w:numId w:val="4"/>
+        </w:numPr>
+        <w:tabs>
+          <w:tab w:val="left" w:pos="2290"/>
+        </w:tabs>
+        <w:spacing w:line="360" w:lineRule="auto"/>
+        <w:outlineLvl w:val="1"/>
+        <w:rPr>
           <w:rFonts w:ascii="宋体" w:hAnsi="宋体"/>
           <w:szCs w:val="21"/>
         </w:rPr>
@@ -1910,6 +2495,66 @@
         <w:t>运行结果截图：</w:t>
       </w:r>
     </w:p>
+    <w:tbl>
+      <w:tblPr>
+        <w:tblStyle w:val="9"/>
+        <w:tblW w:w="0" w:type="auto"/>
+        <w:tblInd w:w="14" w:type="dxa"/>
+        <w:tblBorders>
+          <w:top w:val="single" w:color="000000" w:themeColor="text1" w:sz="4" w:space="0"/>
+          <w:left w:val="single" w:color="000000" w:themeColor="text1" w:sz="4" w:space="0"/>
+          <w:bottom w:val="single" w:color="000000" w:themeColor="text1" w:sz="4" w:space="0"/>
+          <w:right w:val="single" w:color="000000" w:themeColor="text1" w:sz="4" w:space="0"/>
+          <w:insideH w:val="single" w:color="000000" w:themeColor="text1" w:sz="4" w:space="0"/>
+          <w:insideV w:val="single" w:color="000000" w:themeColor="text1" w:sz="4" w:space="0"/>
+        </w:tblBorders>
+        <w:tblLayout w:type="autofit"/>
+        <w:tblCellMar>
+          <w:top w:w="0" w:type="dxa"/>
+          <w:left w:w="108" w:type="dxa"/>
+          <w:bottom w:w="0" w:type="dxa"/>
+          <w:right w:w="108" w:type="dxa"/>
+        </w:tblCellMar>
+      </w:tblPr>
+      <w:tblGrid>
+        <w:gridCol w:w="6799"/>
+      </w:tblGrid>
+      <w:tr>
+        <w:tblPrEx>
+          <w:tblBorders>
+            <w:top w:val="single" w:color="000000" w:themeColor="text1" w:sz="4" w:space="0"/>
+            <w:left w:val="single" w:color="000000" w:themeColor="text1" w:sz="4" w:space="0"/>
+            <w:bottom w:val="single" w:color="000000" w:themeColor="text1" w:sz="4" w:space="0"/>
+            <w:right w:val="single" w:color="000000" w:themeColor="text1" w:sz="4" w:space="0"/>
+            <w:insideH w:val="single" w:color="000000" w:themeColor="text1" w:sz="4" w:space="0"/>
+            <w:insideV w:val="single" w:color="000000" w:themeColor="text1" w:sz="4" w:space="0"/>
+          </w:tblBorders>
+          <w:tblCellMar>
+            <w:top w:w="0" w:type="dxa"/>
+            <w:left w:w="108" w:type="dxa"/>
+            <w:bottom w:w="0" w:type="dxa"/>
+            <w:right w:w="108" w:type="dxa"/>
+          </w:tblCellMar>
+        </w:tblPrEx>
+        <w:tc>
+          <w:tcPr>
+            <w:tcW w:w="6799" w:type="dxa"/>
+          </w:tcPr>
+          <w:p>
+            <w:pPr>
+              <w:rPr/>
+            </w:pPr>
+          </w:p>
+          <w:p/>
+          <w:p/>
+          <w:p>
+            <w:pPr>
+              <w:rPr/>
+            </w:pPr>
+          </w:p>
+        </w:tc>
+      </w:tr>
+    </w:tbl>
     <w:p/>
     <w:p>
       <w:pPr>
@@ -2059,7 +2704,7 @@
       <w:pPr>
         <w:numPr>
           <w:ilvl w:val="0"/>
-          <w:numId w:val="3"/>
+          <w:numId w:val="4"/>
         </w:numPr>
         <w:tabs>
           <w:tab w:val="left" w:pos="2290"/>
@@ -2086,8 +2731,6 @@
         </w:rPr>
         <w:t>0</w:t>
       </w:r>
-      <w:bookmarkStart w:id="0" w:name="_GoBack"/>
-      <w:bookmarkEnd w:id="0"/>
       <w:r>
         <w:rPr>
           <w:rFonts w:hint="eastAsia" w:ascii="宋体" w:hAnsi="宋体"/>
@@ -2117,14 +2760,86 @@
         <w:t>运行结果截图：</w:t>
       </w:r>
     </w:p>
-    <w:p>
-      <w:pPr>
-        <w:rPr>
-          <w:rFonts w:asciiTheme="minorEastAsia" w:hAnsiTheme="minorEastAsia"/>
-          <w:szCs w:val="21"/>
-        </w:rPr>
-      </w:pPr>
-    </w:p>
+    <w:tbl>
+      <w:tblPr>
+        <w:tblStyle w:val="9"/>
+        <w:tblW w:w="0" w:type="auto"/>
+        <w:tblInd w:w="14" w:type="dxa"/>
+        <w:tblBorders>
+          <w:top w:val="single" w:color="000000" w:themeColor="text1" w:sz="4" w:space="0"/>
+          <w:left w:val="single" w:color="000000" w:themeColor="text1" w:sz="4" w:space="0"/>
+          <w:bottom w:val="single" w:color="000000" w:themeColor="text1" w:sz="4" w:space="0"/>
+          <w:right w:val="single" w:color="000000" w:themeColor="text1" w:sz="4" w:space="0"/>
+          <w:insideH w:val="single" w:color="000000" w:themeColor="text1" w:sz="4" w:space="0"/>
+          <w:insideV w:val="single" w:color="000000" w:themeColor="text1" w:sz="4" w:space="0"/>
+        </w:tblBorders>
+        <w:tblLayout w:type="autofit"/>
+        <w:tblCellMar>
+          <w:top w:w="0" w:type="dxa"/>
+          <w:left w:w="108" w:type="dxa"/>
+          <w:bottom w:w="0" w:type="dxa"/>
+          <w:right w:w="108" w:type="dxa"/>
+        </w:tblCellMar>
+      </w:tblPr>
+      <w:tblGrid>
+        <w:gridCol w:w="6799"/>
+      </w:tblGrid>
+      <w:tr>
+        <w:tblPrEx>
+          <w:tblBorders>
+            <w:top w:val="single" w:color="000000" w:themeColor="text1" w:sz="4" w:space="0"/>
+            <w:left w:val="single" w:color="000000" w:themeColor="text1" w:sz="4" w:space="0"/>
+            <w:bottom w:val="single" w:color="000000" w:themeColor="text1" w:sz="4" w:space="0"/>
+            <w:right w:val="single" w:color="000000" w:themeColor="text1" w:sz="4" w:space="0"/>
+            <w:insideH w:val="single" w:color="000000" w:themeColor="text1" w:sz="4" w:space="0"/>
+            <w:insideV w:val="single" w:color="000000" w:themeColor="text1" w:sz="4" w:space="0"/>
+          </w:tblBorders>
+          <w:tblCellMar>
+            <w:top w:w="0" w:type="dxa"/>
+            <w:left w:w="108" w:type="dxa"/>
+            <w:bottom w:w="0" w:type="dxa"/>
+            <w:right w:w="108" w:type="dxa"/>
+          </w:tblCellMar>
+        </w:tblPrEx>
+        <w:tc>
+          <w:tcPr>
+            <w:tcW w:w="6799" w:type="dxa"/>
+          </w:tcPr>
+          <w:p>
+            <w:pPr>
+              <w:rPr>
+                <w:rFonts w:asciiTheme="minorEastAsia" w:hAnsiTheme="minorEastAsia"/>
+                <w:szCs w:val="21"/>
+              </w:rPr>
+            </w:pPr>
+          </w:p>
+          <w:p>
+            <w:pPr>
+              <w:rPr>
+                <w:rFonts w:asciiTheme="minorEastAsia" w:hAnsiTheme="minorEastAsia"/>
+                <w:szCs w:val="21"/>
+              </w:rPr>
+            </w:pPr>
+          </w:p>
+          <w:p>
+            <w:pPr>
+              <w:rPr>
+                <w:rFonts w:asciiTheme="minorEastAsia" w:hAnsiTheme="minorEastAsia"/>
+                <w:szCs w:val="21"/>
+              </w:rPr>
+            </w:pPr>
+          </w:p>
+          <w:p>
+            <w:pPr>
+              <w:rPr>
+                <w:rFonts w:asciiTheme="minorEastAsia" w:hAnsiTheme="minorEastAsia"/>
+                <w:szCs w:val="21"/>
+              </w:rPr>
+            </w:pPr>
+          </w:p>
+        </w:tc>
+      </w:tr>
+    </w:tbl>
     <w:p>
       <w:pPr>
         <w:tabs>
@@ -2273,7 +2988,7 @@
       <w:pPr>
         <w:numPr>
           <w:ilvl w:val="0"/>
-          <w:numId w:val="3"/>
+          <w:numId w:val="4"/>
         </w:numPr>
         <w:tabs>
           <w:tab w:val="left" w:pos="2290"/>
@@ -2328,6 +3043,80 @@
         <w:t>运行结果截图：</w:t>
       </w:r>
     </w:p>
+    <w:tbl>
+      <w:tblPr>
+        <w:tblStyle w:val="9"/>
+        <w:tblW w:w="0" w:type="auto"/>
+        <w:tblInd w:w="14" w:type="dxa"/>
+        <w:tblBorders>
+          <w:top w:val="single" w:color="000000" w:themeColor="text1" w:sz="4" w:space="0"/>
+          <w:left w:val="single" w:color="000000" w:themeColor="text1" w:sz="4" w:space="0"/>
+          <w:bottom w:val="single" w:color="000000" w:themeColor="text1" w:sz="4" w:space="0"/>
+          <w:right w:val="single" w:color="000000" w:themeColor="text1" w:sz="4" w:space="0"/>
+          <w:insideH w:val="single" w:color="000000" w:themeColor="text1" w:sz="4" w:space="0"/>
+          <w:insideV w:val="single" w:color="000000" w:themeColor="text1" w:sz="4" w:space="0"/>
+        </w:tblBorders>
+        <w:tblLayout w:type="autofit"/>
+        <w:tblCellMar>
+          <w:top w:w="0" w:type="dxa"/>
+          <w:left w:w="108" w:type="dxa"/>
+          <w:bottom w:w="0" w:type="dxa"/>
+          <w:right w:w="108" w:type="dxa"/>
+        </w:tblCellMar>
+      </w:tblPr>
+      <w:tblGrid>
+        <w:gridCol w:w="6799"/>
+      </w:tblGrid>
+      <w:tr>
+        <w:tblPrEx>
+          <w:tblBorders>
+            <w:top w:val="single" w:color="000000" w:themeColor="text1" w:sz="4" w:space="0"/>
+            <w:left w:val="single" w:color="000000" w:themeColor="text1" w:sz="4" w:space="0"/>
+            <w:bottom w:val="single" w:color="000000" w:themeColor="text1" w:sz="4" w:space="0"/>
+            <w:right w:val="single" w:color="000000" w:themeColor="text1" w:sz="4" w:space="0"/>
+            <w:insideH w:val="single" w:color="000000" w:themeColor="text1" w:sz="4" w:space="0"/>
+            <w:insideV w:val="single" w:color="000000" w:themeColor="text1" w:sz="4" w:space="0"/>
+          </w:tblBorders>
+        </w:tblPrEx>
+        <w:tc>
+          <w:tcPr>
+            <w:tcW w:w="6799" w:type="dxa"/>
+          </w:tcPr>
+          <w:p>
+            <w:pPr>
+              <w:rPr>
+                <w:rFonts w:asciiTheme="minorEastAsia" w:hAnsiTheme="minorEastAsia"/>
+                <w:szCs w:val="21"/>
+              </w:rPr>
+            </w:pPr>
+          </w:p>
+          <w:p>
+            <w:pPr>
+              <w:rPr>
+                <w:rFonts w:asciiTheme="minorEastAsia" w:hAnsiTheme="minorEastAsia"/>
+                <w:szCs w:val="21"/>
+              </w:rPr>
+            </w:pPr>
+          </w:p>
+          <w:p>
+            <w:pPr>
+              <w:rPr>
+                <w:rFonts w:asciiTheme="minorEastAsia" w:hAnsiTheme="minorEastAsia"/>
+                <w:szCs w:val="21"/>
+              </w:rPr>
+            </w:pPr>
+          </w:p>
+          <w:p>
+            <w:pPr>
+              <w:rPr>
+                <w:rFonts w:asciiTheme="minorEastAsia" w:hAnsiTheme="minorEastAsia"/>
+                <w:szCs w:val="21"/>
+              </w:rPr>
+            </w:pPr>
+          </w:p>
+        </w:tc>
+      </w:tr>
+    </w:tbl>
     <w:p>
       <w:pPr>
         <w:rPr>
@@ -2482,639 +3271,6 @@
     </w:tbl>
     <w:p>
       <w:pPr>
-        <w:numPr>
-          <w:ilvl w:val="0"/>
-          <w:numId w:val="3"/>
-        </w:numPr>
-        <w:tabs>
-          <w:tab w:val="left" w:pos="2290"/>
-        </w:tabs>
-        <w:spacing w:line="360" w:lineRule="auto"/>
-        <w:outlineLvl w:val="1"/>
-        <w:rPr>
-          <w:rFonts w:ascii="宋体" w:hAnsi="宋体"/>
-          <w:szCs w:val="21"/>
-        </w:rPr>
-      </w:pPr>
-      <w:r>
-        <w:rPr>
-          <w:rFonts w:hint="eastAsia" w:ascii="宋体" w:hAnsi="宋体"/>
-          <w:szCs w:val="21"/>
-        </w:rPr>
-        <w:t>（1</w:t>
-      </w:r>
-      <w:r>
-        <w:rPr>
-          <w:rFonts w:ascii="宋体" w:hAnsi="宋体"/>
-          <w:szCs w:val="21"/>
-        </w:rPr>
-        <w:t>0</w:t>
-      </w:r>
-      <w:r>
-        <w:rPr>
-          <w:rFonts w:hint="eastAsia" w:ascii="宋体" w:hAnsi="宋体"/>
-          <w:szCs w:val="21"/>
-        </w:rPr>
-        <w:t>分）</w:t>
-      </w:r>
-    </w:p>
-    <w:p>
-      <w:pPr>
-        <w:tabs>
-          <w:tab w:val="left" w:pos="2290"/>
-        </w:tabs>
-        <w:spacing w:line="360" w:lineRule="auto"/>
-        <w:ind w:left="11"/>
-        <w:outlineLvl w:val="2"/>
-        <w:rPr>
-          <w:rFonts w:asciiTheme="minorEastAsia" w:hAnsiTheme="minorEastAsia"/>
-          <w:szCs w:val="21"/>
-        </w:rPr>
-      </w:pPr>
-      <w:r>
-        <w:rPr>
-          <w:rFonts w:hint="eastAsia" w:asciiTheme="minorEastAsia" w:hAnsiTheme="minorEastAsia"/>
-          <w:szCs w:val="21"/>
-        </w:rPr>
-        <w:t>运行结果截图：</w:t>
-      </w:r>
-    </w:p>
-    <w:p>
-      <w:pPr>
-        <w:rPr>
-          <w:rFonts w:asciiTheme="minorEastAsia" w:hAnsiTheme="minorEastAsia"/>
-          <w:szCs w:val="21"/>
-        </w:rPr>
-      </w:pPr>
-    </w:p>
-    <w:p>
-      <w:pPr>
-        <w:tabs>
-          <w:tab w:val="left" w:pos="2290"/>
-        </w:tabs>
-        <w:spacing w:line="360" w:lineRule="auto"/>
-        <w:ind w:left="11"/>
-        <w:outlineLvl w:val="2"/>
-        <w:rPr>
-          <w:rFonts w:asciiTheme="minorEastAsia" w:hAnsiTheme="minorEastAsia"/>
-          <w:szCs w:val="21"/>
-        </w:rPr>
-      </w:pPr>
-      <w:r>
-        <w:rPr>
-          <w:rFonts w:hint="eastAsia" w:asciiTheme="minorEastAsia" w:hAnsiTheme="minorEastAsia"/>
-          <w:szCs w:val="21"/>
-        </w:rPr>
-        <w:t>相关源代码：</w:t>
-      </w:r>
-    </w:p>
-    <w:tbl>
-      <w:tblPr>
-        <w:tblStyle w:val="9"/>
-        <w:tblW w:w="0" w:type="auto"/>
-        <w:tblInd w:w="14" w:type="dxa"/>
-        <w:tblBorders>
-          <w:top w:val="single" w:color="000000" w:themeColor="text1" w:sz="4" w:space="0"/>
-          <w:left w:val="single" w:color="000000" w:themeColor="text1" w:sz="4" w:space="0"/>
-          <w:bottom w:val="single" w:color="000000" w:themeColor="text1" w:sz="4" w:space="0"/>
-          <w:right w:val="single" w:color="000000" w:themeColor="text1" w:sz="4" w:space="0"/>
-          <w:insideH w:val="single" w:color="000000" w:themeColor="text1" w:sz="4" w:space="0"/>
-          <w:insideV w:val="single" w:color="000000" w:themeColor="text1" w:sz="4" w:space="0"/>
-        </w:tblBorders>
-        <w:tblLayout w:type="autofit"/>
-        <w:tblCellMar>
-          <w:top w:w="0" w:type="dxa"/>
-          <w:left w:w="108" w:type="dxa"/>
-          <w:bottom w:w="0" w:type="dxa"/>
-          <w:right w:w="108" w:type="dxa"/>
-        </w:tblCellMar>
-      </w:tblPr>
-      <w:tblGrid>
-        <w:gridCol w:w="8508"/>
-      </w:tblGrid>
-      <w:tr>
-        <w:tblPrEx>
-          <w:tblBorders>
-            <w:top w:val="single" w:color="000000" w:themeColor="text1" w:sz="4" w:space="0"/>
-            <w:left w:val="single" w:color="000000" w:themeColor="text1" w:sz="4" w:space="0"/>
-            <w:bottom w:val="single" w:color="000000" w:themeColor="text1" w:sz="4" w:space="0"/>
-            <w:right w:val="single" w:color="000000" w:themeColor="text1" w:sz="4" w:space="0"/>
-            <w:insideH w:val="single" w:color="000000" w:themeColor="text1" w:sz="4" w:space="0"/>
-            <w:insideV w:val="single" w:color="000000" w:themeColor="text1" w:sz="4" w:space="0"/>
-          </w:tblBorders>
-          <w:tblCellMar>
-            <w:top w:w="0" w:type="dxa"/>
-            <w:left w:w="108" w:type="dxa"/>
-            <w:bottom w:w="0" w:type="dxa"/>
-            <w:right w:w="108" w:type="dxa"/>
-          </w:tblCellMar>
-        </w:tblPrEx>
-        <w:tc>
-          <w:tcPr>
-            <w:tcW w:w="8508" w:type="dxa"/>
-          </w:tcPr>
-          <w:p>
-            <w:pPr>
-              <w:tabs>
-                <w:tab w:val="left" w:pos="2290"/>
-              </w:tabs>
-              <w:spacing w:line="360" w:lineRule="auto"/>
-              <w:rPr>
-                <w:rFonts w:asciiTheme="minorEastAsia" w:hAnsiTheme="minorEastAsia"/>
-                <w:sz w:val="18"/>
-                <w:szCs w:val="18"/>
-              </w:rPr>
-            </w:pPr>
-          </w:p>
-          <w:p>
-            <w:pPr>
-              <w:tabs>
-                <w:tab w:val="left" w:pos="2290"/>
-              </w:tabs>
-              <w:spacing w:line="360" w:lineRule="auto"/>
-              <w:rPr>
-                <w:rFonts w:asciiTheme="minorEastAsia" w:hAnsiTheme="minorEastAsia"/>
-                <w:sz w:val="18"/>
-                <w:szCs w:val="18"/>
-              </w:rPr>
-            </w:pPr>
-          </w:p>
-        </w:tc>
-      </w:tr>
-      <w:tr>
-        <w:tblPrEx>
-          <w:tblBorders>
-            <w:top w:val="single" w:color="000000" w:themeColor="text1" w:sz="4" w:space="0"/>
-            <w:left w:val="single" w:color="000000" w:themeColor="text1" w:sz="4" w:space="0"/>
-            <w:bottom w:val="single" w:color="000000" w:themeColor="text1" w:sz="4" w:space="0"/>
-            <w:right w:val="single" w:color="000000" w:themeColor="text1" w:sz="4" w:space="0"/>
-            <w:insideH w:val="single" w:color="000000" w:themeColor="text1" w:sz="4" w:space="0"/>
-            <w:insideV w:val="single" w:color="000000" w:themeColor="text1" w:sz="4" w:space="0"/>
-          </w:tblBorders>
-          <w:tblCellMar>
-            <w:top w:w="0" w:type="dxa"/>
-            <w:left w:w="108" w:type="dxa"/>
-            <w:bottom w:w="0" w:type="dxa"/>
-            <w:right w:w="108" w:type="dxa"/>
-          </w:tblCellMar>
-        </w:tblPrEx>
-        <w:tc>
-          <w:tcPr>
-            <w:tcW w:w="8508" w:type="dxa"/>
-          </w:tcPr>
-          <w:p>
-            <w:pPr>
-              <w:tabs>
-                <w:tab w:val="left" w:pos="2290"/>
-              </w:tabs>
-              <w:spacing w:line="360" w:lineRule="auto"/>
-              <w:rPr>
-                <w:rFonts w:asciiTheme="minorEastAsia" w:hAnsiTheme="minorEastAsia"/>
-                <w:sz w:val="18"/>
-                <w:szCs w:val="18"/>
-              </w:rPr>
-            </w:pPr>
-          </w:p>
-          <w:p>
-            <w:pPr>
-              <w:tabs>
-                <w:tab w:val="left" w:pos="2290"/>
-              </w:tabs>
-              <w:spacing w:line="360" w:lineRule="auto"/>
-              <w:rPr>
-                <w:rFonts w:asciiTheme="minorEastAsia" w:hAnsiTheme="minorEastAsia"/>
-                <w:sz w:val="18"/>
-                <w:szCs w:val="18"/>
-              </w:rPr>
-            </w:pPr>
-          </w:p>
-        </w:tc>
-      </w:tr>
-    </w:tbl>
-    <w:p>
-      <w:pPr>
-        <w:numPr>
-          <w:ilvl w:val="0"/>
-          <w:numId w:val="3"/>
-        </w:numPr>
-        <w:tabs>
-          <w:tab w:val="left" w:pos="2290"/>
-        </w:tabs>
-        <w:spacing w:line="360" w:lineRule="auto"/>
-        <w:outlineLvl w:val="1"/>
-        <w:rPr>
-          <w:rFonts w:ascii="宋体" w:hAnsi="宋体"/>
-          <w:szCs w:val="21"/>
-        </w:rPr>
-      </w:pPr>
-      <w:r>
-        <w:rPr>
-          <w:rFonts w:hint="eastAsia" w:ascii="宋体" w:hAnsi="宋体"/>
-          <w:szCs w:val="21"/>
-        </w:rPr>
-        <w:t>（1</w:t>
-      </w:r>
-      <w:r>
-        <w:rPr>
-          <w:rFonts w:ascii="宋体" w:hAnsi="宋体"/>
-          <w:szCs w:val="21"/>
-        </w:rPr>
-        <w:t>5</w:t>
-      </w:r>
-      <w:r>
-        <w:rPr>
-          <w:rFonts w:hint="eastAsia" w:ascii="宋体" w:hAnsi="宋体"/>
-          <w:szCs w:val="21"/>
-        </w:rPr>
-        <w:t>分）</w:t>
-      </w:r>
-    </w:p>
-    <w:p>
-      <w:pPr>
-        <w:tabs>
-          <w:tab w:val="left" w:pos="2290"/>
-        </w:tabs>
-        <w:spacing w:line="360" w:lineRule="auto"/>
-        <w:ind w:left="11"/>
-        <w:outlineLvl w:val="2"/>
-        <w:rPr>
-          <w:rFonts w:asciiTheme="minorEastAsia" w:hAnsiTheme="minorEastAsia"/>
-          <w:szCs w:val="21"/>
-        </w:rPr>
-      </w:pPr>
-      <w:r>
-        <w:rPr>
-          <w:rFonts w:hint="eastAsia" w:asciiTheme="minorEastAsia" w:hAnsiTheme="minorEastAsia"/>
-          <w:szCs w:val="21"/>
-        </w:rPr>
-        <w:t>运行结果截图：</w:t>
-      </w:r>
-    </w:p>
-    <w:p>
-      <w:pPr>
-        <w:rPr>
-          <w:rFonts w:asciiTheme="minorEastAsia" w:hAnsiTheme="minorEastAsia"/>
-          <w:szCs w:val="21"/>
-        </w:rPr>
-      </w:pPr>
-    </w:p>
-    <w:p>
-      <w:pPr>
-        <w:tabs>
-          <w:tab w:val="left" w:pos="2290"/>
-        </w:tabs>
-        <w:spacing w:line="360" w:lineRule="auto"/>
-        <w:ind w:left="11"/>
-        <w:outlineLvl w:val="2"/>
-        <w:rPr>
-          <w:rFonts w:asciiTheme="minorEastAsia" w:hAnsiTheme="minorEastAsia"/>
-          <w:szCs w:val="21"/>
-        </w:rPr>
-      </w:pPr>
-      <w:r>
-        <w:rPr>
-          <w:rFonts w:hint="eastAsia" w:asciiTheme="minorEastAsia" w:hAnsiTheme="minorEastAsia"/>
-          <w:szCs w:val="21"/>
-        </w:rPr>
-        <w:t>相关源代码：</w:t>
-      </w:r>
-    </w:p>
-    <w:tbl>
-      <w:tblPr>
-        <w:tblStyle w:val="9"/>
-        <w:tblW w:w="0" w:type="auto"/>
-        <w:tblInd w:w="14" w:type="dxa"/>
-        <w:tblBorders>
-          <w:top w:val="single" w:color="000000" w:themeColor="text1" w:sz="4" w:space="0"/>
-          <w:left w:val="single" w:color="000000" w:themeColor="text1" w:sz="4" w:space="0"/>
-          <w:bottom w:val="single" w:color="000000" w:themeColor="text1" w:sz="4" w:space="0"/>
-          <w:right w:val="single" w:color="000000" w:themeColor="text1" w:sz="4" w:space="0"/>
-          <w:insideH w:val="single" w:color="000000" w:themeColor="text1" w:sz="4" w:space="0"/>
-          <w:insideV w:val="single" w:color="000000" w:themeColor="text1" w:sz="4" w:space="0"/>
-        </w:tblBorders>
-        <w:tblLayout w:type="autofit"/>
-        <w:tblCellMar>
-          <w:top w:w="0" w:type="dxa"/>
-          <w:left w:w="108" w:type="dxa"/>
-          <w:bottom w:w="0" w:type="dxa"/>
-          <w:right w:w="108" w:type="dxa"/>
-        </w:tblCellMar>
-      </w:tblPr>
-      <w:tblGrid>
-        <w:gridCol w:w="8508"/>
-      </w:tblGrid>
-      <w:tr>
-        <w:tblPrEx>
-          <w:tblBorders>
-            <w:top w:val="single" w:color="000000" w:themeColor="text1" w:sz="4" w:space="0"/>
-            <w:left w:val="single" w:color="000000" w:themeColor="text1" w:sz="4" w:space="0"/>
-            <w:bottom w:val="single" w:color="000000" w:themeColor="text1" w:sz="4" w:space="0"/>
-            <w:right w:val="single" w:color="000000" w:themeColor="text1" w:sz="4" w:space="0"/>
-            <w:insideH w:val="single" w:color="000000" w:themeColor="text1" w:sz="4" w:space="0"/>
-            <w:insideV w:val="single" w:color="000000" w:themeColor="text1" w:sz="4" w:space="0"/>
-          </w:tblBorders>
-          <w:tblCellMar>
-            <w:top w:w="0" w:type="dxa"/>
-            <w:left w:w="108" w:type="dxa"/>
-            <w:bottom w:w="0" w:type="dxa"/>
-            <w:right w:w="108" w:type="dxa"/>
-          </w:tblCellMar>
-        </w:tblPrEx>
-        <w:tc>
-          <w:tcPr>
-            <w:tcW w:w="8508" w:type="dxa"/>
-          </w:tcPr>
-          <w:p>
-            <w:pPr>
-              <w:tabs>
-                <w:tab w:val="left" w:pos="2290"/>
-              </w:tabs>
-              <w:spacing w:line="360" w:lineRule="auto"/>
-              <w:rPr>
-                <w:rFonts w:asciiTheme="minorEastAsia" w:hAnsiTheme="minorEastAsia"/>
-                <w:sz w:val="18"/>
-                <w:szCs w:val="18"/>
-              </w:rPr>
-            </w:pPr>
-          </w:p>
-          <w:p>
-            <w:pPr>
-              <w:tabs>
-                <w:tab w:val="left" w:pos="2290"/>
-              </w:tabs>
-              <w:spacing w:line="360" w:lineRule="auto"/>
-              <w:rPr>
-                <w:rFonts w:asciiTheme="minorEastAsia" w:hAnsiTheme="minorEastAsia"/>
-                <w:sz w:val="18"/>
-                <w:szCs w:val="18"/>
-              </w:rPr>
-            </w:pPr>
-          </w:p>
-        </w:tc>
-      </w:tr>
-      <w:tr>
-        <w:tblPrEx>
-          <w:tblBorders>
-            <w:top w:val="single" w:color="000000" w:themeColor="text1" w:sz="4" w:space="0"/>
-            <w:left w:val="single" w:color="000000" w:themeColor="text1" w:sz="4" w:space="0"/>
-            <w:bottom w:val="single" w:color="000000" w:themeColor="text1" w:sz="4" w:space="0"/>
-            <w:right w:val="single" w:color="000000" w:themeColor="text1" w:sz="4" w:space="0"/>
-            <w:insideH w:val="single" w:color="000000" w:themeColor="text1" w:sz="4" w:space="0"/>
-            <w:insideV w:val="single" w:color="000000" w:themeColor="text1" w:sz="4" w:space="0"/>
-          </w:tblBorders>
-          <w:tblCellMar>
-            <w:top w:w="0" w:type="dxa"/>
-            <w:left w:w="108" w:type="dxa"/>
-            <w:bottom w:w="0" w:type="dxa"/>
-            <w:right w:w="108" w:type="dxa"/>
-          </w:tblCellMar>
-        </w:tblPrEx>
-        <w:tc>
-          <w:tcPr>
-            <w:tcW w:w="8508" w:type="dxa"/>
-          </w:tcPr>
-          <w:p>
-            <w:pPr>
-              <w:tabs>
-                <w:tab w:val="left" w:pos="2290"/>
-              </w:tabs>
-              <w:spacing w:line="360" w:lineRule="auto"/>
-              <w:rPr>
-                <w:rFonts w:asciiTheme="minorEastAsia" w:hAnsiTheme="minorEastAsia"/>
-                <w:sz w:val="18"/>
-                <w:szCs w:val="18"/>
-              </w:rPr>
-            </w:pPr>
-          </w:p>
-          <w:p>
-            <w:pPr>
-              <w:tabs>
-                <w:tab w:val="left" w:pos="2290"/>
-              </w:tabs>
-              <w:spacing w:line="360" w:lineRule="auto"/>
-              <w:rPr>
-                <w:rFonts w:asciiTheme="minorEastAsia" w:hAnsiTheme="minorEastAsia"/>
-                <w:sz w:val="18"/>
-                <w:szCs w:val="18"/>
-              </w:rPr>
-            </w:pPr>
-          </w:p>
-        </w:tc>
-      </w:tr>
-    </w:tbl>
-    <w:p>
-      <w:pPr>
-        <w:numPr>
-          <w:ilvl w:val="0"/>
-          <w:numId w:val="3"/>
-        </w:numPr>
-        <w:tabs>
-          <w:tab w:val="left" w:pos="2290"/>
-        </w:tabs>
-        <w:spacing w:line="360" w:lineRule="auto"/>
-        <w:outlineLvl w:val="1"/>
-        <w:rPr>
-          <w:rFonts w:ascii="宋体" w:hAnsi="宋体"/>
-          <w:szCs w:val="21"/>
-        </w:rPr>
-      </w:pPr>
-      <w:r>
-        <w:rPr>
-          <w:rFonts w:hint="eastAsia" w:ascii="宋体" w:hAnsi="宋体"/>
-          <w:szCs w:val="21"/>
-        </w:rPr>
-        <w:t>（1</w:t>
-      </w:r>
-      <w:r>
-        <w:rPr>
-          <w:rFonts w:ascii="宋体" w:hAnsi="宋体"/>
-          <w:szCs w:val="21"/>
-        </w:rPr>
-        <w:t>5</w:t>
-      </w:r>
-      <w:r>
-        <w:rPr>
-          <w:rFonts w:hint="eastAsia" w:ascii="宋体" w:hAnsi="宋体"/>
-          <w:szCs w:val="21"/>
-        </w:rPr>
-        <w:t>分）</w:t>
-      </w:r>
-    </w:p>
-    <w:p>
-      <w:pPr>
-        <w:tabs>
-          <w:tab w:val="left" w:pos="2290"/>
-        </w:tabs>
-        <w:spacing w:line="360" w:lineRule="auto"/>
-        <w:ind w:left="11"/>
-        <w:outlineLvl w:val="2"/>
-        <w:rPr>
-          <w:rFonts w:asciiTheme="minorEastAsia" w:hAnsiTheme="minorEastAsia"/>
-          <w:szCs w:val="21"/>
-        </w:rPr>
-      </w:pPr>
-      <w:r>
-        <w:rPr>
-          <w:rFonts w:hint="eastAsia" w:asciiTheme="minorEastAsia" w:hAnsiTheme="minorEastAsia"/>
-          <w:szCs w:val="21"/>
-        </w:rPr>
-        <w:t>运行结果截图：</w:t>
-      </w:r>
-    </w:p>
-    <w:p>
-      <w:pPr>
-        <w:rPr>
-          <w:rFonts w:asciiTheme="minorEastAsia" w:hAnsiTheme="minorEastAsia"/>
-          <w:szCs w:val="21"/>
-        </w:rPr>
-      </w:pPr>
-    </w:p>
-    <w:p>
-      <w:pPr>
-        <w:tabs>
-          <w:tab w:val="left" w:pos="2290"/>
-        </w:tabs>
-        <w:spacing w:line="360" w:lineRule="auto"/>
-        <w:ind w:left="11"/>
-        <w:outlineLvl w:val="2"/>
-        <w:rPr>
-          <w:rFonts w:asciiTheme="minorEastAsia" w:hAnsiTheme="minorEastAsia"/>
-          <w:szCs w:val="21"/>
-        </w:rPr>
-      </w:pPr>
-      <w:r>
-        <w:rPr>
-          <w:rFonts w:hint="eastAsia" w:asciiTheme="minorEastAsia" w:hAnsiTheme="minorEastAsia"/>
-          <w:szCs w:val="21"/>
-        </w:rPr>
-        <w:t>相关源代码：</w:t>
-      </w:r>
-    </w:p>
-    <w:tbl>
-      <w:tblPr>
-        <w:tblStyle w:val="9"/>
-        <w:tblW w:w="0" w:type="auto"/>
-        <w:tblInd w:w="14" w:type="dxa"/>
-        <w:tblBorders>
-          <w:top w:val="single" w:color="000000" w:themeColor="text1" w:sz="4" w:space="0"/>
-          <w:left w:val="single" w:color="000000" w:themeColor="text1" w:sz="4" w:space="0"/>
-          <w:bottom w:val="single" w:color="000000" w:themeColor="text1" w:sz="4" w:space="0"/>
-          <w:right w:val="single" w:color="000000" w:themeColor="text1" w:sz="4" w:space="0"/>
-          <w:insideH w:val="single" w:color="000000" w:themeColor="text1" w:sz="4" w:space="0"/>
-          <w:insideV w:val="single" w:color="000000" w:themeColor="text1" w:sz="4" w:space="0"/>
-        </w:tblBorders>
-        <w:tblLayout w:type="autofit"/>
-        <w:tblCellMar>
-          <w:top w:w="0" w:type="dxa"/>
-          <w:left w:w="108" w:type="dxa"/>
-          <w:bottom w:w="0" w:type="dxa"/>
-          <w:right w:w="108" w:type="dxa"/>
-        </w:tblCellMar>
-      </w:tblPr>
-      <w:tblGrid>
-        <w:gridCol w:w="8508"/>
-      </w:tblGrid>
-      <w:tr>
-        <w:tblPrEx>
-          <w:tblBorders>
-            <w:top w:val="single" w:color="000000" w:themeColor="text1" w:sz="4" w:space="0"/>
-            <w:left w:val="single" w:color="000000" w:themeColor="text1" w:sz="4" w:space="0"/>
-            <w:bottom w:val="single" w:color="000000" w:themeColor="text1" w:sz="4" w:space="0"/>
-            <w:right w:val="single" w:color="000000" w:themeColor="text1" w:sz="4" w:space="0"/>
-            <w:insideH w:val="single" w:color="000000" w:themeColor="text1" w:sz="4" w:space="0"/>
-            <w:insideV w:val="single" w:color="000000" w:themeColor="text1" w:sz="4" w:space="0"/>
-          </w:tblBorders>
-          <w:tblCellMar>
-            <w:top w:w="0" w:type="dxa"/>
-            <w:left w:w="108" w:type="dxa"/>
-            <w:bottom w:w="0" w:type="dxa"/>
-            <w:right w:w="108" w:type="dxa"/>
-          </w:tblCellMar>
-        </w:tblPrEx>
-        <w:tc>
-          <w:tcPr>
-            <w:tcW w:w="8508" w:type="dxa"/>
-          </w:tcPr>
-          <w:p>
-            <w:pPr>
-              <w:tabs>
-                <w:tab w:val="left" w:pos="2290"/>
-              </w:tabs>
-              <w:spacing w:line="360" w:lineRule="auto"/>
-              <w:rPr>
-                <w:rFonts w:asciiTheme="minorEastAsia" w:hAnsiTheme="minorEastAsia"/>
-                <w:sz w:val="18"/>
-                <w:szCs w:val="18"/>
-              </w:rPr>
-            </w:pPr>
-          </w:p>
-          <w:p>
-            <w:pPr>
-              <w:tabs>
-                <w:tab w:val="left" w:pos="2290"/>
-              </w:tabs>
-              <w:spacing w:line="360" w:lineRule="auto"/>
-              <w:rPr>
-                <w:rFonts w:asciiTheme="minorEastAsia" w:hAnsiTheme="minorEastAsia"/>
-                <w:sz w:val="18"/>
-                <w:szCs w:val="18"/>
-              </w:rPr>
-            </w:pPr>
-          </w:p>
-        </w:tc>
-      </w:tr>
-      <w:tr>
-        <w:tblPrEx>
-          <w:tblBorders>
-            <w:top w:val="single" w:color="000000" w:themeColor="text1" w:sz="4" w:space="0"/>
-            <w:left w:val="single" w:color="000000" w:themeColor="text1" w:sz="4" w:space="0"/>
-            <w:bottom w:val="single" w:color="000000" w:themeColor="text1" w:sz="4" w:space="0"/>
-            <w:right w:val="single" w:color="000000" w:themeColor="text1" w:sz="4" w:space="0"/>
-            <w:insideH w:val="single" w:color="000000" w:themeColor="text1" w:sz="4" w:space="0"/>
-            <w:insideV w:val="single" w:color="000000" w:themeColor="text1" w:sz="4" w:space="0"/>
-          </w:tblBorders>
-          <w:tblCellMar>
-            <w:top w:w="0" w:type="dxa"/>
-            <w:left w:w="108" w:type="dxa"/>
-            <w:bottom w:w="0" w:type="dxa"/>
-            <w:right w:w="108" w:type="dxa"/>
-          </w:tblCellMar>
-        </w:tblPrEx>
-        <w:tc>
-          <w:tcPr>
-            <w:tcW w:w="8508" w:type="dxa"/>
-          </w:tcPr>
-          <w:p>
-            <w:pPr>
-              <w:tabs>
-                <w:tab w:val="left" w:pos="2290"/>
-              </w:tabs>
-              <w:spacing w:line="360" w:lineRule="auto"/>
-              <w:rPr>
-                <w:rFonts w:asciiTheme="minorEastAsia" w:hAnsiTheme="minorEastAsia"/>
-                <w:sz w:val="18"/>
-                <w:szCs w:val="18"/>
-              </w:rPr>
-            </w:pPr>
-          </w:p>
-          <w:p>
-            <w:pPr>
-              <w:tabs>
-                <w:tab w:val="left" w:pos="2290"/>
-              </w:tabs>
-              <w:spacing w:line="360" w:lineRule="auto"/>
-              <w:rPr>
-                <w:rFonts w:asciiTheme="minorEastAsia" w:hAnsiTheme="minorEastAsia"/>
-                <w:sz w:val="18"/>
-                <w:szCs w:val="18"/>
-              </w:rPr>
-            </w:pPr>
-          </w:p>
-        </w:tc>
-      </w:tr>
-    </w:tbl>
-    <w:p>
-      <w:pPr>
         <w:tabs>
           <w:tab w:val="left" w:pos="2290"/>
         </w:tabs>
@@ -3435,6 +3591,96 @@
       </w:pPr>
     </w:lvl>
   </w:abstractNum>
+  <w:abstractNum w:abstractNumId="3">
+    <w:nsid w:val="72A7288B"/>
+    <w:multiLevelType w:val="multilevel"/>
+    <w:tmpl w:val="72A7288B"/>
+    <w:lvl w:ilvl="0" w:tentative="0">
+      <w:start w:val="1"/>
+      <w:numFmt w:val="decimal"/>
+      <w:suff w:val="space"/>
+      <w:lvlText w:val="%1."/>
+      <w:lvlJc w:val="left"/>
+      <w:pPr>
+        <w:ind w:left="420" w:hanging="420"/>
+      </w:pPr>
+      <w:rPr>
+        <w:rFonts w:hint="eastAsia"/>
+      </w:rPr>
+    </w:lvl>
+    <w:lvl w:ilvl="1" w:tentative="0">
+      <w:start w:val="1"/>
+      <w:numFmt w:val="lowerLetter"/>
+      <w:lvlText w:val="%2)"/>
+      <w:lvlJc w:val="left"/>
+      <w:pPr>
+        <w:ind w:left="840" w:hanging="420"/>
+      </w:pPr>
+    </w:lvl>
+    <w:lvl w:ilvl="2" w:tentative="0">
+      <w:start w:val="1"/>
+      <w:numFmt w:val="lowerRoman"/>
+      <w:lvlText w:val="%3."/>
+      <w:lvlJc w:val="right"/>
+      <w:pPr>
+        <w:ind w:left="1260" w:hanging="420"/>
+      </w:pPr>
+    </w:lvl>
+    <w:lvl w:ilvl="3" w:tentative="0">
+      <w:start w:val="1"/>
+      <w:numFmt w:val="decimal"/>
+      <w:lvlText w:val="%4."/>
+      <w:lvlJc w:val="left"/>
+      <w:pPr>
+        <w:ind w:left="1680" w:hanging="420"/>
+      </w:pPr>
+    </w:lvl>
+    <w:lvl w:ilvl="4" w:tentative="0">
+      <w:start w:val="1"/>
+      <w:numFmt w:val="lowerLetter"/>
+      <w:lvlText w:val="%5)"/>
+      <w:lvlJc w:val="left"/>
+      <w:pPr>
+        <w:ind w:left="2100" w:hanging="420"/>
+      </w:pPr>
+    </w:lvl>
+    <w:lvl w:ilvl="5" w:tentative="0">
+      <w:start w:val="1"/>
+      <w:numFmt w:val="lowerRoman"/>
+      <w:lvlText w:val="%6."/>
+      <w:lvlJc w:val="right"/>
+      <w:pPr>
+        <w:ind w:left="2520" w:hanging="420"/>
+      </w:pPr>
+    </w:lvl>
+    <w:lvl w:ilvl="6" w:tentative="0">
+      <w:start w:val="1"/>
+      <w:numFmt w:val="decimal"/>
+      <w:lvlText w:val="%7."/>
+      <w:lvlJc w:val="left"/>
+      <w:pPr>
+        <w:ind w:left="2940" w:hanging="420"/>
+      </w:pPr>
+    </w:lvl>
+    <w:lvl w:ilvl="7" w:tentative="0">
+      <w:start w:val="1"/>
+      <w:numFmt w:val="lowerLetter"/>
+      <w:lvlText w:val="%8)"/>
+      <w:lvlJc w:val="left"/>
+      <w:pPr>
+        <w:ind w:left="3360" w:hanging="420"/>
+      </w:pPr>
+    </w:lvl>
+    <w:lvl w:ilvl="8" w:tentative="0">
+      <w:start w:val="1"/>
+      <w:numFmt w:val="lowerRoman"/>
+      <w:lvlText w:val="%9."/>
+      <w:lvlJc w:val="right"/>
+      <w:pPr>
+        <w:ind w:left="3780" w:hanging="420"/>
+      </w:pPr>
+    </w:lvl>
+  </w:abstractNum>
   <w:num w:numId="1">
     <w:abstractNumId w:val="2"/>
   </w:num>
@@ -3442,6 +3688,9 @@
     <w:abstractNumId w:val="0"/>
   </w:num>
   <w:num w:numId="3">
+    <w:abstractNumId w:val="3"/>
+  </w:num>
+  <w:num w:numId="4">
     <w:abstractNumId w:val="1"/>
   </w:num>
 </w:numbering>
@@ -3452,7 +3701,7 @@
   <w:docDefaults>
     <w:rPrDefault>
       <w:rPr>
-        <w:rFonts w:asciiTheme="minorHAnsi" w:hAnsiTheme="minorHAnsi" w:eastAsiaTheme="minorEastAsia" w:cstheme="minorBidi"/>
+        <w:rFonts w:ascii="Times New Roman" w:hAnsi="Times New Roman" w:eastAsia="宋体" w:cs="Times New Roman"/>
       </w:rPr>
     </w:rPrDefault>
     <w:pPrDefault/>

</xml_diff>